<commit_message>
feat: implement dynamic tag scanning and mapping for certificates
</commit_message>
<xml_diff>
--- a/CHECKLISTS/BOTTOM INSPECTION/CHECK LIST/BS-02.docx
+++ b/CHECKLISTS/BOTTOM INSPECTION/CHECK LIST/BS-02.docx
@@ -2394,22 +2394,18 @@
           <w:trHeight w:hRule="exact" w:val="434"/>
         </w:trPr>
         <w:tc>
-          <w:tcPr>
-            <w:tcW w:w="3099" w:type="dxa"/>
-            <w:tcBorders>
-              <w:top w:val="single" w:sz="5" w:space="0" w:color="000000"/>
-              <w:left w:val="single" w:sz="5" w:space="0" w:color="000000"/>
-              <w:bottom w:val="single" w:sz="5" w:space="0" w:color="000000"/>
-              <w:right w:val="single" w:sz="5" w:space="0" w:color="000000"/>
-            </w:tcBorders>
-          </w:tcPr>
-          <w:p>
-            <w:pPr>
-              <w:rPr>
-                <w:rFonts w:cstheme="minorHAnsi"/>
-              </w:rPr>
-            </w:pPr>
-          </w:p>
+          <w:sdt>
+            <w:sdtPr>
+              <w:tag w:val="vessel_name"/>
+            </w:sdtPr>
+            <w:sdtContent>
+              <w:p>
+                <w:r>
+                  <w:t>{vessel_name}</w:t>
+                </w:r>
+              </w:p>
+            </w:sdtContent>
+          </w:sdt>
         </w:tc>
         <w:tc>
           <w:tcPr>
@@ -4689,22 +4685,18 @@
           <w:trHeight w:hRule="exact" w:val="434"/>
         </w:trPr>
         <w:tc>
-          <w:tcPr>
-            <w:tcW w:w="3099" w:type="dxa"/>
-            <w:tcBorders>
-              <w:top w:val="single" w:sz="5" w:space="0" w:color="000000"/>
-              <w:left w:val="single" w:sz="5" w:space="0" w:color="000000"/>
-              <w:bottom w:val="single" w:sz="5" w:space="0" w:color="000000"/>
-              <w:right w:val="single" w:sz="5" w:space="0" w:color="000000"/>
-            </w:tcBorders>
-          </w:tcPr>
-          <w:p>
-            <w:pPr>
-              <w:rPr>
-                <w:rFonts w:cstheme="minorHAnsi"/>
-              </w:rPr>
-            </w:pPr>
-          </w:p>
+          <w:sdt>
+            <w:sdtPr>
+              <w:tag w:val="vessel_name"/>
+            </w:sdtPr>
+            <w:sdtContent>
+              <w:p>
+                <w:r>
+                  <w:t>{vessel_name}</w:t>
+                </w:r>
+              </w:p>
+            </w:sdtContent>
+          </w:sdt>
         </w:tc>
         <w:tc>
           <w:tcPr>
@@ -7941,22 +7933,18 @@
           <w:trHeight w:hRule="exact" w:val="434"/>
         </w:trPr>
         <w:tc>
-          <w:tcPr>
-            <w:tcW w:w="3099" w:type="dxa"/>
-            <w:tcBorders>
-              <w:top w:val="single" w:sz="5" w:space="0" w:color="000000"/>
-              <w:left w:val="single" w:sz="5" w:space="0" w:color="000000"/>
-              <w:bottom w:val="single" w:sz="5" w:space="0" w:color="000000"/>
-              <w:right w:val="single" w:sz="5" w:space="0" w:color="000000"/>
-            </w:tcBorders>
-          </w:tcPr>
-          <w:p>
-            <w:pPr>
-              <w:rPr>
-                <w:rFonts w:cstheme="minorHAnsi"/>
-              </w:rPr>
-            </w:pPr>
-          </w:p>
+          <w:sdt>
+            <w:sdtPr>
+              <w:tag w:val="vessel_name"/>
+            </w:sdtPr>
+            <w:sdtContent>
+              <w:p>
+                <w:r>
+                  <w:t>{vessel_name}</w:t>
+                </w:r>
+              </w:p>
+            </w:sdtContent>
+          </w:sdt>
         </w:tc>
         <w:tc>
           <w:tcPr>

</xml_diff>